<commit_message>
Bloco 1 — Ajustes do feedback da cliente
- feat: botão de download em Word (.docx) além do PDF
- fix: remoção de parágrafos vazios duplos em todas as procurações
- fix: remoção da expressão "e de minha família" na Declaração de Hipossuficiência
- feat: RG e órgão emissor agora opcionais no cadastro de cliente
- migration: 009_rg_opcional.sql removendo NOT NULL das colunas rg

Refs: feedback da Dra. Alcione de 13/05/2026
</commit_message>
<xml_diff>
--- a/templates/05_procuracao_bpc_adulto.docx
+++ b/templates/05_procuracao_bpc_adulto.docx
@@ -283,12 +283,6 @@
         </w:rPr>
       </w:pPr>
     </w:p>
-    <w:p>
-      <w:pPr>
-        <w:shd w:val="clear" w:color="auto" w:fill="FFFFFF"/>
-        <w:jc w:val="both"/>
-      </w:pPr>
-    </w:p>
     <w:p/>
     <w:p>
       <w:pPr>
@@ -329,16 +323,6 @@
         </w:rPr>
         <w:t>de 2026.</w:t>
       </w:r>
-    </w:p>
-    <w:p>
-      <w:pPr>
-        <w:spacing w:after="240"/>
-      </w:pPr>
-    </w:p>
-    <w:p>
-      <w:pPr>
-        <w:spacing w:after="240"/>
-      </w:pPr>
     </w:p>
     <w:p>
       <w:pPr>
@@ -407,32 +391,6 @@
           <w:color w:val="000000"/>
         </w:rPr>
         <w:t>                  JOSÉ GOMES DE LIMA</w:t>
-      </w:r>
-    </w:p>
-    <w:p>
-      <w:pPr>
-        <w:spacing w:line="340" w:lineRule="exact"/>
-        <w:ind w:firstLine="2835"/>
-        <w:jc w:val="both"/>
-        <w:rPr>
-          <w:rFonts w:ascii="Courier New" w:hAnsi="Courier New" w:cs="Courier New"/>
-        </w:rPr>
-      </w:pPr>
-    </w:p>
-    <w:p>
-      <w:pPr>
-        <w:spacing w:line="340" w:lineRule="exact"/>
-        <w:ind w:firstLine="2835"/>
-        <w:jc w:val="both"/>
-        <w:rPr>
-          <w:rFonts w:ascii="Courier New" w:hAnsi="Courier New" w:cs="Courier New"/>
-        </w:rPr>
-      </w:pPr>
-      <w:r>
-        <w:rPr>
-          <w:rFonts w:ascii="Courier New" w:hAnsi="Courier New" w:cs="Courier New"/>
-        </w:rPr>
-        <w:t xml:space="preserve"> </w:t>
       </w:r>
     </w:p>
     <w:p/>

</xml_diff>